<commit_message>
Filter Tier 3 to actionable/risk-stratifying genes only
Add ACTIONABLE_TIER3_GENES whitelist (KIT, XPO1, PIM1, BIRC3, EP300,
KMT2C, FBXW7, BCOR) — genes with FDA-approved/trial drug targets or
prognostic value. Drop non-actionable Tier 3 genes (EBF1, WHSC1, etc.)
from reports. Applied across annotate_vcf.py, reformat_tiers.py, and
ctdna_gui.py. Regenerated all tiered reports and docx.

Co-Authored-By: Claude Opus 4.6 <noreply@anthropic.com>
</commit_message>
<xml_diff>
--- a/0224/01-JJH_10679562/01-JJH_10679562_clinical_report.docx
+++ b/0224/01-JJH_10679562/01-JJH_10679562_clinical_report.docx
@@ -7816,7 +7816,7 @@
                 <w:b w:val="0"/>
                 <w:sz w:val="18"/>
               </w:rPr>
-              <w:t>EBF1</w:t>
+              <w:t>KIT</w:t>
             </w:r>
           </w:p>
         </w:tc>
@@ -7850,7 +7850,7 @@
                 <w:b w:val="0"/>
                 <w:sz w:val="18"/>
               </w:rPr>
-              <w:t>ENST00000313708.6</w:t>
+              <w:t>ENST00000288135.5</w:t>
             </w:r>
           </w:p>
           <w:p>
@@ -7902,6 +7902,7 @@
                 <w:b w:val="0"/>
                 <w:sz w:val="18"/>
               </w:rPr>
+              <w:t>ENSP00000288135.5</w:t>
             </w:r>
           </w:p>
         </w:tc>
@@ -7936,7 +7937,7 @@
                 <w:b w:val="0"/>
                 <w:sz w:val="18"/>
               </w:rPr>
-              <w:t>c.1370-5C&gt;T</w:t>
+              <w:t>c.2792G&gt;A</w:t>
             </w:r>
           </w:p>
         </w:tc>
@@ -7971,6 +7972,7 @@
                 <w:b w:val="0"/>
                 <w:sz w:val="18"/>
               </w:rPr>
+              <w:t>p.Ser931Asn</w:t>
             </w:r>
           </w:p>
         </w:tc>
@@ -8005,7 +8007,7 @@
                 <w:b w:val="0"/>
                 <w:sz w:val="18"/>
               </w:rPr>
-              <w:t>50.40%</w:t>
+              <w:t>46.03%</w:t>
             </w:r>
           </w:p>
         </w:tc>
@@ -8152,7 +8154,7 @@
                 <w:b w:val="0"/>
                 <w:sz w:val="18"/>
               </w:rPr>
-              <w:t>KIT</w:t>
+              <w:t>KMT2C</w:t>
             </w:r>
           </w:p>
         </w:tc>
@@ -8186,7 +8188,7 @@
                 <w:b w:val="0"/>
                 <w:sz w:val="18"/>
               </w:rPr>
-              <w:t>ENST00000288135.5</w:t>
+              <w:t>ENST00000262189.6</w:t>
             </w:r>
           </w:p>
           <w:p>
@@ -8238,7 +8240,7 @@
                 <w:b w:val="0"/>
                 <w:sz w:val="18"/>
               </w:rPr>
-              <w:t>ENSP00000288135.5</w:t>
+              <w:t>ENSP00000262189.6</w:t>
             </w:r>
           </w:p>
         </w:tc>
@@ -8273,7 +8275,7 @@
                 <w:b w:val="0"/>
                 <w:sz w:val="18"/>
               </w:rPr>
-              <w:t>c.2792G&gt;A</w:t>
+              <w:t>c.2755G&gt;C</w:t>
             </w:r>
           </w:p>
         </w:tc>
@@ -8308,7 +8310,7 @@
                 <w:b w:val="0"/>
                 <w:sz w:val="18"/>
               </w:rPr>
-              <w:t>p.Ser931Asn</w:t>
+              <w:t>p.Val919Leu</w:t>
             </w:r>
           </w:p>
         </w:tc>
@@ -8343,7 +8345,7 @@
                 <w:b w:val="0"/>
                 <w:sz w:val="18"/>
               </w:rPr>
-              <w:t>46.03%</w:t>
+              <w:t>12.57%</w:t>
             </w:r>
           </w:p>
         </w:tc>
@@ -8490,7 +8492,7 @@
                 <w:b w:val="0"/>
                 <w:sz w:val="18"/>
               </w:rPr>
-              <w:t>EBF1</w:t>
+              <w:t>KMT2C</w:t>
             </w:r>
           </w:p>
         </w:tc>
@@ -8524,7 +8526,7 @@
                 <w:b w:val="0"/>
                 <w:sz w:val="18"/>
               </w:rPr>
-              <w:t>ENST00000313708.6</w:t>
+              <w:t>ENST00000262189.6</w:t>
             </w:r>
           </w:p>
           <w:p>
@@ -8576,7 +8578,7 @@
                 <w:b w:val="0"/>
                 <w:sz w:val="18"/>
               </w:rPr>
-              <w:t>ENSP00000322898.6</w:t>
+              <w:t>ENSP00000262189.6</w:t>
             </w:r>
           </w:p>
         </w:tc>
@@ -8611,7 +8613,7 @@
                 <w:b w:val="0"/>
                 <w:sz w:val="18"/>
               </w:rPr>
-              <w:t>c.581G&gt;A</w:t>
+              <w:t>c.1017G&gt;C</w:t>
             </w:r>
           </w:p>
         </w:tc>
@@ -8646,7 +8648,7 @@
                 <w:b w:val="0"/>
                 <w:sz w:val="18"/>
               </w:rPr>
-              <w:t>p.Cys194Tyr</w:t>
+              <w:t>p.Lys339Asn</w:t>
             </w:r>
           </w:p>
         </w:tc>
@@ -8681,7 +8683,7 @@
                 <w:b w:val="0"/>
                 <w:sz w:val="18"/>
               </w:rPr>
-              <w:t>32.42%</w:t>
+              <w:t>9.22%</w:t>
             </w:r>
           </w:p>
         </w:tc>
@@ -8949,7 +8951,7 @@
                 <w:b w:val="0"/>
                 <w:sz w:val="18"/>
               </w:rPr>
-              <w:t>c.2755G&gt;C</w:t>
+              <w:t>c.925C&gt;T</w:t>
             </w:r>
           </w:p>
         </w:tc>
@@ -8984,7 +8986,7 @@
                 <w:b w:val="0"/>
                 <w:sz w:val="18"/>
               </w:rPr>
-              <w:t>p.Val919Leu</w:t>
+              <w:t>p.Pro309Ser</w:t>
             </w:r>
           </w:p>
         </w:tc>
@@ -9019,7 +9021,7 @@
                 <w:b w:val="0"/>
                 <w:sz w:val="18"/>
               </w:rPr>
-              <w:t>12.57%</w:t>
+              <w:t>8.89%</w:t>
             </w:r>
           </w:p>
         </w:tc>
@@ -9287,7 +9289,7 @@
                 <w:b w:val="0"/>
                 <w:sz w:val="18"/>
               </w:rPr>
-              <w:t>c.1017G&gt;C</w:t>
+              <w:t>c.1042G&gt;A</w:t>
             </w:r>
           </w:p>
         </w:tc>
@@ -9322,7 +9324,7 @@
                 <w:b w:val="0"/>
                 <w:sz w:val="18"/>
               </w:rPr>
-              <w:t>p.Lys339Asn</w:t>
+              <w:t>p.Asp348Asn</w:t>
             </w:r>
           </w:p>
         </w:tc>
@@ -9357,7 +9359,7 @@
                 <w:b w:val="0"/>
                 <w:sz w:val="18"/>
               </w:rPr>
-              <w:t>9.22%</w:t>
+              <w:t>8.38%</w:t>
             </w:r>
           </w:p>
         </w:tc>
@@ -9625,7 +9627,7 @@
                 <w:b w:val="0"/>
                 <w:sz w:val="18"/>
               </w:rPr>
-              <w:t>c.925C&gt;T</w:t>
+              <w:t>c.851G&gt;A</w:t>
             </w:r>
           </w:p>
         </w:tc>
@@ -9660,7 +9662,7 @@
                 <w:b w:val="0"/>
                 <w:sz w:val="18"/>
               </w:rPr>
-              <w:t>p.Pro309Ser</w:t>
+              <w:t>p.Arg284Gln</w:t>
             </w:r>
           </w:p>
         </w:tc>
@@ -9695,7 +9697,7 @@
                 <w:b w:val="0"/>
                 <w:sz w:val="18"/>
               </w:rPr>
-              <w:t>8.89%</w:t>
+              <w:t>6.62%</w:t>
             </w:r>
           </w:p>
         </w:tc>
@@ -9963,7 +9965,7 @@
                 <w:b w:val="0"/>
                 <w:sz w:val="18"/>
               </w:rPr>
-              <w:t>c.1042G&gt;A</w:t>
+              <w:t>c.2657G&gt;A</w:t>
             </w:r>
           </w:p>
         </w:tc>
@@ -9998,7 +10000,7 @@
                 <w:b w:val="0"/>
                 <w:sz w:val="18"/>
               </w:rPr>
-              <w:t>p.Asp348Asn</w:t>
+              <w:t>p.Arg886His</w:t>
             </w:r>
           </w:p>
         </w:tc>
@@ -10033,7 +10035,7 @@
                 <w:b w:val="0"/>
                 <w:sz w:val="18"/>
               </w:rPr>
-              <w:t>8.38%</w:t>
+              <w:t>5.35%</w:t>
             </w:r>
           </w:p>
         </w:tc>
@@ -10301,7 +10303,7 @@
                 <w:b w:val="0"/>
                 <w:sz w:val="18"/>
               </w:rPr>
-              <w:t>c.851G&gt;A</w:t>
+              <w:t>c.943G&gt;T</w:t>
             </w:r>
           </w:p>
         </w:tc>
@@ -10336,7 +10338,7 @@
                 <w:b w:val="0"/>
                 <w:sz w:val="18"/>
               </w:rPr>
-              <w:t>p.Arg284Gln</w:t>
+              <w:t>p.Gly315Cys</w:t>
             </w:r>
           </w:p>
         </w:tc>
@@ -10371,7 +10373,7 @@
                 <w:b w:val="0"/>
                 <w:sz w:val="18"/>
               </w:rPr>
-              <w:t>6.62%</w:t>
+              <w:t>4.88%</w:t>
             </w:r>
           </w:p>
         </w:tc>
@@ -10518,7 +10520,7 @@
                 <w:b w:val="0"/>
                 <w:sz w:val="18"/>
               </w:rPr>
-              <w:t>KMT2C</w:t>
+              <w:t>FBXW7</w:t>
             </w:r>
           </w:p>
         </w:tc>
@@ -10552,7 +10554,7 @@
                 <w:b w:val="0"/>
                 <w:sz w:val="18"/>
               </w:rPr>
-              <w:t>ENST00000262189.6</w:t>
+              <w:t>ENST00000281708.4</w:t>
             </w:r>
           </w:p>
           <w:p>
@@ -10604,7 +10606,6 @@
                 <w:b w:val="0"/>
                 <w:sz w:val="18"/>
               </w:rPr>
-              <w:t>ENSP00000262189.6</w:t>
             </w:r>
           </w:p>
         </w:tc>
@@ -10639,7 +10640,7 @@
                 <w:b w:val="0"/>
                 <w:sz w:val="18"/>
               </w:rPr>
-              <w:t>c.2657G&gt;A</w:t>
+              <w:t>c.585-17T&gt;C</w:t>
             </w:r>
           </w:p>
         </w:tc>
@@ -10674,7 +10675,6 @@
                 <w:b w:val="0"/>
                 <w:sz w:val="18"/>
               </w:rPr>
-              <w:t>p.Arg886His</w:t>
             </w:r>
           </w:p>
         </w:tc>
@@ -10709,7 +10709,7 @@
                 <w:b w:val="0"/>
                 <w:sz w:val="18"/>
               </w:rPr>
-              <w:t>5.35%</w:t>
+              <w:t>3.03%</w:t>
             </w:r>
           </w:p>
         </w:tc>
@@ -10977,7 +10977,7 @@
                 <w:b w:val="0"/>
                 <w:sz w:val="18"/>
               </w:rPr>
-              <w:t>c.943G&gt;T</w:t>
+              <w:t>c.2263C&gt;T</w:t>
             </w:r>
           </w:p>
         </w:tc>
@@ -11012,7 +11012,7 @@
                 <w:b w:val="0"/>
                 <w:sz w:val="18"/>
               </w:rPr>
-              <w:t>p.Gly315Cys</w:t>
+              <w:t>p.Gln755Ter</w:t>
             </w:r>
           </w:p>
         </w:tc>
@@ -11047,1353 +11047,7 @@
                 <w:b w:val="0"/>
                 <w:sz w:val="18"/>
               </w:rPr>
-              <w:t>4.88%</w:t>
-            </w:r>
-          </w:p>
-        </w:tc>
-        <w:tc>
-          <w:tcPr>
-            <w:tcW w:w="2214" w:type="dxa"/>
-            <w:tcBorders>
-              <w:top w:val="double" w:sz="4" w:space="0" w:color="auto"/>
-              <w:bottom w:val="double" w:sz="4" w:space="0" w:color="auto"/>
-            </w:tcBorders>
-            <w:vAlign w:val="center"/>
-          </w:tcPr>
-          <w:p>
-            <w:pPr>
-              <w:jc w:val="center"/>
-              <w:cnfStyle w:val="000000100000" w:firstRow="0" w:lastRow="0" w:firstColumn="0" w:lastColumn="0" w:oddVBand="0" w:evenVBand="0" w:oddHBand="1" w:evenHBand="0" w:firstRowFirstColumn="0" w:firstRowLastColumn="0" w:lastRowFirstColumn="0" w:lastRowLastColumn="0"/>
-              <w:rPr>
-                <w:b/>
-                <w:sz w:val="16"/>
-              </w:rPr>
-            </w:pPr>
-            <w:r>
-              <w:rPr>
-                <w:b/>
-                <w:sz w:val="16"/>
-              </w:rPr>
-            </w:r>
-            <w:proofErr w:type="spellStart"/>
-            <w:r>
-              <w:rPr>
-                <w:b/>
-                <w:sz w:val="16"/>
-              </w:rPr>
-            </w:r>
-            <w:proofErr w:type="spellEnd"/>
-            <w:r>
-              <w:rPr>
-                <w:rFonts w:ascii="Malgun Gothic" w:hAnsi="Malgun Gothic"/>
-                <w:b w:val="0"/>
-                <w:sz w:val="18"/>
-              </w:rPr>
-            </w:r>
-          </w:p>
-          <w:p>
-            <w:pPr>
-              <w:jc w:val="center"/>
-              <w:cnfStyle w:val="000000100000" w:firstRow="0" w:lastRow="0" w:firstColumn="0" w:lastColumn="0" w:oddVBand="0" w:evenVBand="0" w:oddHBand="1" w:evenHBand="0" w:firstRowFirstColumn="0" w:firstRowLastColumn="0" w:lastRowFirstColumn="0" w:lastRowLastColumn="0"/>
-              <w:rPr>
-                <w:rFonts w:ascii="Arial Narrow" w:hAnsi="Arial Narrow" w:cs="Calibri"/>
-                <w:b/>
-                <w:sz w:val="16"/>
-              </w:rPr>
-            </w:pPr>
-            <w:r>
-              <w:rPr>
-                <w:b/>
-                <w:sz w:val="14"/>
-              </w:rPr>
-            </w:r>
-            <w:proofErr w:type="spellStart"/>
-            <w:r>
-              <w:rPr>
-                <w:b/>
-                <w:sz w:val="14"/>
-              </w:rPr>
-            </w:r>
-            <w:proofErr w:type="spellEnd"/>
-            <w:r>
-              <w:rPr>
-                <w:b/>
-                <w:sz w:val="14"/>
-              </w:rPr>
-            </w:r>
-          </w:p>
-        </w:tc>
-      </w:tr>
-      <w:tr>
-        <w:trPr>
-          <w:cnfStyle w:val="000000100000" w:firstRow="0" w:lastRow="0" w:firstColumn="0" w:lastColumn="0" w:oddVBand="0" w:evenVBand="0" w:oddHBand="1" w:evenHBand="0" w:firstRowFirstColumn="0" w:firstRowLastColumn="0" w:lastRowFirstColumn="0" w:lastRowLastColumn="0"/>
-          <w:trHeight w:hRule="exact" w:val="624"/>
-        </w:trPr>
-        <w:tc>
-          <w:tcPr>
-            <w:cnfStyle w:val="001000000000" w:firstRow="0" w:lastRow="0" w:firstColumn="1" w:lastColumn="0" w:oddVBand="0" w:evenVBand="0" w:oddHBand="0" w:evenHBand="0" w:firstRowFirstColumn="0" w:firstRowLastColumn="0" w:lastRowFirstColumn="0" w:lastRowLastColumn="0"/>
-            <w:tcW w:w="1276" w:type="dxa"/>
-            <w:tcBorders>
-              <w:top w:val="double" w:sz="4" w:space="0" w:color="auto"/>
-              <w:bottom w:val="double" w:sz="4" w:space="0" w:color="auto"/>
-            </w:tcBorders>
-            <w:vAlign w:val="center"/>
-          </w:tcPr>
-          <w:p>
-            <w:pPr>
-              <w:spacing w:after="160" w:line="259" w:lineRule="auto"/>
-              <w:jc w:val="center"/>
-              <w:rPr>
-                <w:sz w:val="16"/>
-              </w:rPr>
-            </w:pPr>
-            <w:r>
-              <w:rPr>
-                <w:caps w:val="0"/>
-                <w:sz w:val="16"/>
-              </w:rPr>
-            </w:r>
-            <w:r>
-              <w:rPr>
-                <w:rFonts w:ascii="Malgun Gothic" w:hAnsi="Malgun Gothic"/>
-                <w:b w:val="0"/>
-                <w:sz w:val="18"/>
-              </w:rPr>
-              <w:t>Tier 3</w:t>
-            </w:r>
-          </w:p>
-        </w:tc>
-        <w:tc>
-          <w:tcPr>
-            <w:tcW w:w="1134" w:type="dxa"/>
-            <w:tcBorders>
-              <w:top w:val="double" w:sz="4" w:space="0" w:color="auto"/>
-              <w:bottom w:val="double" w:sz="4" w:space="0" w:color="auto"/>
-            </w:tcBorders>
-            <w:vAlign w:val="center"/>
-          </w:tcPr>
-          <w:p>
-            <w:pPr>
-              <w:jc w:val="center"/>
-              <w:cnfStyle w:val="000000100000" w:firstRow="0" w:lastRow="0" w:firstColumn="0" w:lastColumn="0" w:oddVBand="0" w:evenVBand="0" w:oddHBand="1" w:evenHBand="0" w:firstRowFirstColumn="0" w:firstRowLastColumn="0" w:lastRowFirstColumn="0" w:lastRowLastColumn="0"/>
-              <w:rPr>
-                <w:rFonts w:ascii="Arial Narrow" w:hAnsi="Arial Narrow" w:cs="Calibri"/>
-                <w:b/>
-                <w:sz w:val="16"/>
-              </w:rPr>
-            </w:pPr>
-            <w:r>
-              <w:rPr>
-                <w:b/>
-                <w:sz w:val="16"/>
-              </w:rPr>
-            </w:r>
-            <w:r>
-              <w:rPr>
-                <w:rFonts w:ascii="Malgun Gothic" w:hAnsi="Malgun Gothic"/>
-                <w:b w:val="0"/>
-                <w:sz w:val="18"/>
-              </w:rPr>
-              <w:t>EBF1</w:t>
-            </w:r>
-          </w:p>
-        </w:tc>
-        <w:tc>
-          <w:tcPr>
-            <w:tcW w:w="1134" w:type="dxa"/>
-            <w:tcBorders>
-              <w:top w:val="double" w:sz="4" w:space="0" w:color="auto"/>
-              <w:bottom w:val="double" w:sz="4" w:space="0" w:color="auto"/>
-            </w:tcBorders>
-            <w:vAlign w:val="center"/>
-          </w:tcPr>
-          <w:p>
-            <w:pPr>
-              <w:jc w:val="center"/>
-              <w:cnfStyle w:val="000000100000" w:firstRow="0" w:lastRow="0" w:firstColumn="0" w:lastColumn="0" w:oddVBand="0" w:evenVBand="0" w:oddHBand="1" w:evenHBand="0" w:firstRowFirstColumn="0" w:firstRowLastColumn="0" w:lastRowFirstColumn="0" w:lastRowLastColumn="0"/>
-              <w:rPr>
-                <w:b/>
-                <w:sz w:val="16"/>
-              </w:rPr>
-            </w:pPr>
-            <w:r>
-              <w:rPr>
-                <w:b/>
-                <w:sz w:val="16"/>
-              </w:rPr>
-            </w:r>
-            <w:r>
-              <w:rPr>
-                <w:rFonts w:ascii="Malgun Gothic" w:hAnsi="Malgun Gothic"/>
-                <w:b w:val="0"/>
-                <w:sz w:val="18"/>
-              </w:rPr>
-              <w:t>ENST00000313708.6</w:t>
-            </w:r>
-          </w:p>
-          <w:p>
-            <w:pPr>
-              <w:jc w:val="center"/>
-              <w:cnfStyle w:val="000000100000" w:firstRow="0" w:lastRow="0" w:firstColumn="0" w:lastColumn="0" w:oddVBand="0" w:evenVBand="0" w:oddHBand="1" w:evenHBand="0" w:firstRowFirstColumn="0" w:firstRowLastColumn="0" w:lastRowFirstColumn="0" w:lastRowLastColumn="0"/>
-              <w:rPr>
-                <w:rFonts w:ascii="Arial Narrow" w:hAnsi="Arial Narrow" w:cs="Calibri"/>
-                <w:b/>
-                <w:sz w:val="16"/>
-              </w:rPr>
-            </w:pPr>
-            <w:r>
-              <w:rPr>
-                <w:b/>
-                <w:sz w:val="16"/>
-              </w:rPr>
-            </w:r>
-          </w:p>
-        </w:tc>
-        <w:tc>
-          <w:tcPr>
-            <w:tcW w:w="1418" w:type="dxa"/>
-            <w:tcBorders>
-              <w:top w:val="double" w:sz="4" w:space="0" w:color="auto"/>
-              <w:bottom w:val="double" w:sz="4" w:space="0" w:color="auto"/>
-            </w:tcBorders>
-            <w:vAlign w:val="center"/>
-          </w:tcPr>
-          <w:p>
-            <w:pPr>
-              <w:jc w:val="center"/>
-              <w:cnfStyle w:val="000000100000" w:firstRow="0" w:lastRow="0" w:firstColumn="0" w:lastColumn="0" w:oddVBand="0" w:evenVBand="0" w:oddHBand="1" w:evenHBand="0" w:firstRowFirstColumn="0" w:firstRowLastColumn="0" w:lastRowFirstColumn="0" w:lastRowLastColumn="0"/>
-              <w:rPr>
-                <w:rFonts w:ascii="Arial Narrow" w:hAnsi="Arial Narrow" w:cs="Calibri"/>
-                <w:b/>
-                <w:sz w:val="16"/>
-              </w:rPr>
-            </w:pPr>
-            <w:r>
-              <w:rPr>
-                <w:b/>
-                <w:sz w:val="16"/>
-              </w:rPr>
-            </w:r>
-            <w:r>
-              <w:rPr>
-                <w:rFonts w:ascii="Malgun Gothic" w:hAnsi="Malgun Gothic"/>
-                <w:b w:val="0"/>
-                <w:sz w:val="18"/>
-              </w:rPr>
-            </w:r>
-          </w:p>
-        </w:tc>
-        <w:tc>
-          <w:tcPr>
-            <w:tcW w:w="1275" w:type="dxa"/>
-            <w:tcBorders>
-              <w:top w:val="double" w:sz="4" w:space="0" w:color="auto"/>
-              <w:bottom w:val="double" w:sz="4" w:space="0" w:color="auto"/>
-            </w:tcBorders>
-            <w:vAlign w:val="center"/>
-          </w:tcPr>
-          <w:p>
-            <w:pPr>
-              <w:spacing w:after="160" w:line="259" w:lineRule="auto"/>
-              <w:jc w:val="center"/>
-              <w:cnfStyle w:val="000000100000" w:firstRow="0" w:lastRow="0" w:firstColumn="0" w:lastColumn="0" w:oddVBand="0" w:evenVBand="0" w:oddHBand="1" w:evenHBand="0" w:firstRowFirstColumn="0" w:firstRowLastColumn="0" w:lastRowFirstColumn="0" w:lastRowLastColumn="0"/>
-              <w:rPr>
-                <w:b/>
-                <w:sz w:val="16"/>
-              </w:rPr>
-            </w:pPr>
-            <w:r>
-              <w:rPr>
-                <w:b/>
-                <w:sz w:val="16"/>
-              </w:rPr>
-            </w:r>
-            <w:r>
-              <w:rPr>
-                <w:rFonts w:ascii="Malgun Gothic" w:hAnsi="Malgun Gothic"/>
-                <w:b w:val="0"/>
-                <w:sz w:val="18"/>
-              </w:rPr>
-              <w:t>c.412-9T&gt;A</w:t>
-            </w:r>
-          </w:p>
-        </w:tc>
-        <w:tc>
-          <w:tcPr>
-            <w:tcW w:w="1276" w:type="dxa"/>
-            <w:tcBorders>
-              <w:top w:val="double" w:sz="4" w:space="0" w:color="auto"/>
-              <w:bottom w:val="double" w:sz="4" w:space="0" w:color="auto"/>
-            </w:tcBorders>
-            <w:vAlign w:val="center"/>
-          </w:tcPr>
-          <w:p>
-            <w:pPr>
-              <w:jc w:val="center"/>
-              <w:cnfStyle w:val="000000100000" w:firstRow="0" w:lastRow="0" w:firstColumn="0" w:lastColumn="0" w:oddVBand="0" w:evenVBand="0" w:oddHBand="1" w:evenHBand="0" w:firstRowFirstColumn="0" w:firstRowLastColumn="0" w:lastRowFirstColumn="0" w:lastRowLastColumn="0"/>
-              <w:rPr>
-                <w:rFonts w:ascii="Arial Narrow" w:hAnsi="Arial Narrow" w:cs="Calibri"/>
-                <w:b/>
-                <w:sz w:val="16"/>
-              </w:rPr>
-            </w:pPr>
-            <w:r>
-              <w:rPr>
-                <w:b/>
-                <w:sz w:val="16"/>
-              </w:rPr>
-            </w:r>
-            <w:r>
-              <w:rPr>
-                <w:rFonts w:ascii="Malgun Gothic" w:hAnsi="Malgun Gothic"/>
-                <w:b w:val="0"/>
-                <w:sz w:val="18"/>
-              </w:rPr>
-            </w:r>
-          </w:p>
-        </w:tc>
-        <w:tc>
-          <w:tcPr>
-            <w:tcW w:w="709" w:type="dxa"/>
-            <w:tcBorders>
-              <w:top w:val="double" w:sz="4" w:space="0" w:color="auto"/>
-              <w:bottom w:val="double" w:sz="4" w:space="0" w:color="auto"/>
-            </w:tcBorders>
-            <w:vAlign w:val="center"/>
-          </w:tcPr>
-          <w:p>
-            <w:pPr>
-              <w:jc w:val="center"/>
-              <w:cnfStyle w:val="000000100000" w:firstRow="0" w:lastRow="0" w:firstColumn="0" w:lastColumn="0" w:oddVBand="0" w:evenVBand="0" w:oddHBand="1" w:evenHBand="0" w:firstRowFirstColumn="0" w:firstRowLastColumn="0" w:lastRowFirstColumn="0" w:lastRowLastColumn="0"/>
-              <w:rPr>
-                <w:rFonts w:ascii="Arial Narrow" w:hAnsi="Arial Narrow" w:cs="Calibri"/>
-                <w:b/>
-                <w:sz w:val="16"/>
-              </w:rPr>
-            </w:pPr>
-            <w:r>
-              <w:rPr>
-                <w:b/>
-                <w:sz w:val="16"/>
-              </w:rPr>
-            </w:r>
-            <w:r>
-              <w:rPr>
-                <w:rFonts w:ascii="Malgun Gothic" w:hAnsi="Malgun Gothic"/>
-                <w:b w:val="0"/>
-                <w:sz w:val="18"/>
-              </w:rPr>
-              <w:t>3.04%</w:t>
-            </w:r>
-          </w:p>
-        </w:tc>
-        <w:tc>
-          <w:tcPr>
-            <w:tcW w:w="2214" w:type="dxa"/>
-            <w:tcBorders>
-              <w:top w:val="double" w:sz="4" w:space="0" w:color="auto"/>
-              <w:bottom w:val="double" w:sz="4" w:space="0" w:color="auto"/>
-            </w:tcBorders>
-            <w:vAlign w:val="center"/>
-          </w:tcPr>
-          <w:p>
-            <w:pPr>
-              <w:jc w:val="center"/>
-              <w:cnfStyle w:val="000000100000" w:firstRow="0" w:lastRow="0" w:firstColumn="0" w:lastColumn="0" w:oddVBand="0" w:evenVBand="0" w:oddHBand="1" w:evenHBand="0" w:firstRowFirstColumn="0" w:firstRowLastColumn="0" w:lastRowFirstColumn="0" w:lastRowLastColumn="0"/>
-              <w:rPr>
-                <w:b/>
-                <w:sz w:val="16"/>
-              </w:rPr>
-            </w:pPr>
-            <w:r>
-              <w:rPr>
-                <w:b/>
-                <w:sz w:val="16"/>
-              </w:rPr>
-            </w:r>
-            <w:proofErr w:type="spellStart"/>
-            <w:r>
-              <w:rPr>
-                <w:b/>
-                <w:sz w:val="16"/>
-              </w:rPr>
-            </w:r>
-            <w:proofErr w:type="spellEnd"/>
-            <w:r>
-              <w:rPr>
-                <w:rFonts w:ascii="Malgun Gothic" w:hAnsi="Malgun Gothic"/>
-                <w:b w:val="0"/>
-                <w:sz w:val="18"/>
-              </w:rPr>
-            </w:r>
-          </w:p>
-          <w:p>
-            <w:pPr>
-              <w:jc w:val="center"/>
-              <w:cnfStyle w:val="000000100000" w:firstRow="0" w:lastRow="0" w:firstColumn="0" w:lastColumn="0" w:oddVBand="0" w:evenVBand="0" w:oddHBand="1" w:evenHBand="0" w:firstRowFirstColumn="0" w:firstRowLastColumn="0" w:lastRowFirstColumn="0" w:lastRowLastColumn="0"/>
-              <w:rPr>
-                <w:rFonts w:ascii="Arial Narrow" w:hAnsi="Arial Narrow" w:cs="Calibri"/>
-                <w:b/>
-                <w:sz w:val="16"/>
-              </w:rPr>
-            </w:pPr>
-            <w:r>
-              <w:rPr>
-                <w:b/>
-                <w:sz w:val="14"/>
-              </w:rPr>
-            </w:r>
-            <w:proofErr w:type="spellStart"/>
-            <w:r>
-              <w:rPr>
-                <w:b/>
-                <w:sz w:val="14"/>
-              </w:rPr>
-            </w:r>
-            <w:proofErr w:type="spellEnd"/>
-            <w:r>
-              <w:rPr>
-                <w:b/>
-                <w:sz w:val="14"/>
-              </w:rPr>
-            </w:r>
-          </w:p>
-        </w:tc>
-      </w:tr>
-      <w:tr>
-        <w:trPr>
-          <w:cnfStyle w:val="000000100000" w:firstRow="0" w:lastRow="0" w:firstColumn="0" w:lastColumn="0" w:oddVBand="0" w:evenVBand="0" w:oddHBand="1" w:evenHBand="0" w:firstRowFirstColumn="0" w:firstRowLastColumn="0" w:lastRowFirstColumn="0" w:lastRowLastColumn="0"/>
-          <w:trHeight w:hRule="exact" w:val="624"/>
-        </w:trPr>
-        <w:tc>
-          <w:tcPr>
-            <w:cnfStyle w:val="001000000000" w:firstRow="0" w:lastRow="0" w:firstColumn="1" w:lastColumn="0" w:oddVBand="0" w:evenVBand="0" w:oddHBand="0" w:evenHBand="0" w:firstRowFirstColumn="0" w:firstRowLastColumn="0" w:lastRowFirstColumn="0" w:lastRowLastColumn="0"/>
-            <w:tcW w:w="1276" w:type="dxa"/>
-            <w:tcBorders>
-              <w:top w:val="double" w:sz="4" w:space="0" w:color="auto"/>
-              <w:bottom w:val="double" w:sz="4" w:space="0" w:color="auto"/>
-            </w:tcBorders>
-            <w:vAlign w:val="center"/>
-          </w:tcPr>
-          <w:p>
-            <w:pPr>
-              <w:spacing w:after="160" w:line="259" w:lineRule="auto"/>
-              <w:jc w:val="center"/>
-              <w:rPr>
-                <w:sz w:val="16"/>
-              </w:rPr>
-            </w:pPr>
-            <w:r>
-              <w:rPr>
-                <w:caps w:val="0"/>
-                <w:sz w:val="16"/>
-              </w:rPr>
-            </w:r>
-            <w:r>
-              <w:rPr>
-                <w:rFonts w:ascii="Malgun Gothic" w:hAnsi="Malgun Gothic"/>
-                <w:b w:val="0"/>
-                <w:sz w:val="18"/>
-              </w:rPr>
-              <w:t>Tier 3</w:t>
-            </w:r>
-          </w:p>
-        </w:tc>
-        <w:tc>
-          <w:tcPr>
-            <w:tcW w:w="1134" w:type="dxa"/>
-            <w:tcBorders>
-              <w:top w:val="double" w:sz="4" w:space="0" w:color="auto"/>
-              <w:bottom w:val="double" w:sz="4" w:space="0" w:color="auto"/>
-            </w:tcBorders>
-            <w:vAlign w:val="center"/>
-          </w:tcPr>
-          <w:p>
-            <w:pPr>
-              <w:jc w:val="center"/>
-              <w:cnfStyle w:val="000000100000" w:firstRow="0" w:lastRow="0" w:firstColumn="0" w:lastColumn="0" w:oddVBand="0" w:evenVBand="0" w:oddHBand="1" w:evenHBand="0" w:firstRowFirstColumn="0" w:firstRowLastColumn="0" w:lastRowFirstColumn="0" w:lastRowLastColumn="0"/>
-              <w:rPr>
-                <w:rFonts w:ascii="Arial Narrow" w:hAnsi="Arial Narrow" w:cs="Calibri"/>
-                <w:b/>
-                <w:sz w:val="16"/>
-              </w:rPr>
-            </w:pPr>
-            <w:r>
-              <w:rPr>
-                <w:b/>
-                <w:sz w:val="16"/>
-              </w:rPr>
-            </w:r>
-            <w:r>
-              <w:rPr>
-                <w:rFonts w:ascii="Malgun Gothic" w:hAnsi="Malgun Gothic"/>
-                <w:b w:val="0"/>
-                <w:sz w:val="18"/>
-              </w:rPr>
-              <w:t>FBXW7</w:t>
-            </w:r>
-          </w:p>
-        </w:tc>
-        <w:tc>
-          <w:tcPr>
-            <w:tcW w:w="1134" w:type="dxa"/>
-            <w:tcBorders>
-              <w:top w:val="double" w:sz="4" w:space="0" w:color="auto"/>
-              <w:bottom w:val="double" w:sz="4" w:space="0" w:color="auto"/>
-            </w:tcBorders>
-            <w:vAlign w:val="center"/>
-          </w:tcPr>
-          <w:p>
-            <w:pPr>
-              <w:jc w:val="center"/>
-              <w:cnfStyle w:val="000000100000" w:firstRow="0" w:lastRow="0" w:firstColumn="0" w:lastColumn="0" w:oddVBand="0" w:evenVBand="0" w:oddHBand="1" w:evenHBand="0" w:firstRowFirstColumn="0" w:firstRowLastColumn="0" w:lastRowFirstColumn="0" w:lastRowLastColumn="0"/>
-              <w:rPr>
-                <w:b/>
-                <w:sz w:val="16"/>
-              </w:rPr>
-            </w:pPr>
-            <w:r>
-              <w:rPr>
-                <w:b/>
-                <w:sz w:val="16"/>
-              </w:rPr>
-            </w:r>
-            <w:r>
-              <w:rPr>
-                <w:rFonts w:ascii="Malgun Gothic" w:hAnsi="Malgun Gothic"/>
-                <w:b w:val="0"/>
-                <w:sz w:val="18"/>
-              </w:rPr>
-              <w:t>ENST00000281708.4</w:t>
-            </w:r>
-          </w:p>
-          <w:p>
-            <w:pPr>
-              <w:jc w:val="center"/>
-              <w:cnfStyle w:val="000000100000" w:firstRow="0" w:lastRow="0" w:firstColumn="0" w:lastColumn="0" w:oddVBand="0" w:evenVBand="0" w:oddHBand="1" w:evenHBand="0" w:firstRowFirstColumn="0" w:firstRowLastColumn="0" w:lastRowFirstColumn="0" w:lastRowLastColumn="0"/>
-              <w:rPr>
-                <w:rFonts w:ascii="Arial Narrow" w:hAnsi="Arial Narrow" w:cs="Calibri"/>
-                <w:b/>
-                <w:sz w:val="16"/>
-              </w:rPr>
-            </w:pPr>
-            <w:r>
-              <w:rPr>
-                <w:b/>
-                <w:sz w:val="16"/>
-              </w:rPr>
-            </w:r>
-          </w:p>
-        </w:tc>
-        <w:tc>
-          <w:tcPr>
-            <w:tcW w:w="1418" w:type="dxa"/>
-            <w:tcBorders>
-              <w:top w:val="double" w:sz="4" w:space="0" w:color="auto"/>
-              <w:bottom w:val="double" w:sz="4" w:space="0" w:color="auto"/>
-            </w:tcBorders>
-            <w:vAlign w:val="center"/>
-          </w:tcPr>
-          <w:p>
-            <w:pPr>
-              <w:jc w:val="center"/>
-              <w:cnfStyle w:val="000000100000" w:firstRow="0" w:lastRow="0" w:firstColumn="0" w:lastColumn="0" w:oddVBand="0" w:evenVBand="0" w:oddHBand="1" w:evenHBand="0" w:firstRowFirstColumn="0" w:firstRowLastColumn="0" w:lastRowFirstColumn="0" w:lastRowLastColumn="0"/>
-              <w:rPr>
-                <w:rFonts w:ascii="Arial Narrow" w:hAnsi="Arial Narrow" w:cs="Calibri"/>
-                <w:b/>
-                <w:sz w:val="16"/>
-              </w:rPr>
-            </w:pPr>
-            <w:r>
-              <w:rPr>
-                <w:b/>
-                <w:sz w:val="16"/>
-              </w:rPr>
-            </w:r>
-            <w:r>
-              <w:rPr>
-                <w:rFonts w:ascii="Malgun Gothic" w:hAnsi="Malgun Gothic"/>
-                <w:b w:val="0"/>
-                <w:sz w:val="18"/>
-              </w:rPr>
-            </w:r>
-          </w:p>
-        </w:tc>
-        <w:tc>
-          <w:tcPr>
-            <w:tcW w:w="1275" w:type="dxa"/>
-            <w:tcBorders>
-              <w:top w:val="double" w:sz="4" w:space="0" w:color="auto"/>
-              <w:bottom w:val="double" w:sz="4" w:space="0" w:color="auto"/>
-            </w:tcBorders>
-            <w:vAlign w:val="center"/>
-          </w:tcPr>
-          <w:p>
-            <w:pPr>
-              <w:spacing w:after="160" w:line="259" w:lineRule="auto"/>
-              <w:jc w:val="center"/>
-              <w:cnfStyle w:val="000000100000" w:firstRow="0" w:lastRow="0" w:firstColumn="0" w:lastColumn="0" w:oddVBand="0" w:evenVBand="0" w:oddHBand="1" w:evenHBand="0" w:firstRowFirstColumn="0" w:firstRowLastColumn="0" w:lastRowFirstColumn="0" w:lastRowLastColumn="0"/>
-              <w:rPr>
-                <w:b/>
-                <w:sz w:val="16"/>
-              </w:rPr>
-            </w:pPr>
-            <w:r>
-              <w:rPr>
-                <w:b/>
-                <w:sz w:val="16"/>
-              </w:rPr>
-            </w:r>
-            <w:r>
-              <w:rPr>
-                <w:rFonts w:ascii="Malgun Gothic" w:hAnsi="Malgun Gothic"/>
-                <w:b w:val="0"/>
-                <w:sz w:val="18"/>
-              </w:rPr>
-              <w:t>c.585-17T&gt;C</w:t>
-            </w:r>
-          </w:p>
-        </w:tc>
-        <w:tc>
-          <w:tcPr>
-            <w:tcW w:w="1276" w:type="dxa"/>
-            <w:tcBorders>
-              <w:top w:val="double" w:sz="4" w:space="0" w:color="auto"/>
-              <w:bottom w:val="double" w:sz="4" w:space="0" w:color="auto"/>
-            </w:tcBorders>
-            <w:vAlign w:val="center"/>
-          </w:tcPr>
-          <w:p>
-            <w:pPr>
-              <w:jc w:val="center"/>
-              <w:cnfStyle w:val="000000100000" w:firstRow="0" w:lastRow="0" w:firstColumn="0" w:lastColumn="0" w:oddVBand="0" w:evenVBand="0" w:oddHBand="1" w:evenHBand="0" w:firstRowFirstColumn="0" w:firstRowLastColumn="0" w:lastRowFirstColumn="0" w:lastRowLastColumn="0"/>
-              <w:rPr>
-                <w:rFonts w:ascii="Arial Narrow" w:hAnsi="Arial Narrow" w:cs="Calibri"/>
-                <w:b/>
-                <w:sz w:val="16"/>
-              </w:rPr>
-            </w:pPr>
-            <w:r>
-              <w:rPr>
-                <w:b/>
-                <w:sz w:val="16"/>
-              </w:rPr>
-            </w:r>
-            <w:r>
-              <w:rPr>
-                <w:rFonts w:ascii="Malgun Gothic" w:hAnsi="Malgun Gothic"/>
-                <w:b w:val="0"/>
-                <w:sz w:val="18"/>
-              </w:rPr>
-            </w:r>
-          </w:p>
-        </w:tc>
-        <w:tc>
-          <w:tcPr>
-            <w:tcW w:w="709" w:type="dxa"/>
-            <w:tcBorders>
-              <w:top w:val="double" w:sz="4" w:space="0" w:color="auto"/>
-              <w:bottom w:val="double" w:sz="4" w:space="0" w:color="auto"/>
-            </w:tcBorders>
-            <w:vAlign w:val="center"/>
-          </w:tcPr>
-          <w:p>
-            <w:pPr>
-              <w:jc w:val="center"/>
-              <w:cnfStyle w:val="000000100000" w:firstRow="0" w:lastRow="0" w:firstColumn="0" w:lastColumn="0" w:oddVBand="0" w:evenVBand="0" w:oddHBand="1" w:evenHBand="0" w:firstRowFirstColumn="0" w:firstRowLastColumn="0" w:lastRowFirstColumn="0" w:lastRowLastColumn="0"/>
-              <w:rPr>
-                <w:rFonts w:ascii="Arial Narrow" w:hAnsi="Arial Narrow" w:cs="Calibri"/>
-                <w:b/>
-                <w:sz w:val="16"/>
-              </w:rPr>
-            </w:pPr>
-            <w:r>
-              <w:rPr>
-                <w:b/>
-                <w:sz w:val="16"/>
-              </w:rPr>
-            </w:r>
-            <w:r>
-              <w:rPr>
-                <w:rFonts w:ascii="Malgun Gothic" w:hAnsi="Malgun Gothic"/>
-                <w:b w:val="0"/>
-                <w:sz w:val="18"/>
-              </w:rPr>
-              <w:t>3.03%</w:t>
-            </w:r>
-          </w:p>
-        </w:tc>
-        <w:tc>
-          <w:tcPr>
-            <w:tcW w:w="2214" w:type="dxa"/>
-            <w:tcBorders>
-              <w:top w:val="double" w:sz="4" w:space="0" w:color="auto"/>
-              <w:bottom w:val="double" w:sz="4" w:space="0" w:color="auto"/>
-            </w:tcBorders>
-            <w:vAlign w:val="center"/>
-          </w:tcPr>
-          <w:p>
-            <w:pPr>
-              <w:jc w:val="center"/>
-              <w:cnfStyle w:val="000000100000" w:firstRow="0" w:lastRow="0" w:firstColumn="0" w:lastColumn="0" w:oddVBand="0" w:evenVBand="0" w:oddHBand="1" w:evenHBand="0" w:firstRowFirstColumn="0" w:firstRowLastColumn="0" w:lastRowFirstColumn="0" w:lastRowLastColumn="0"/>
-              <w:rPr>
-                <w:b/>
-                <w:sz w:val="16"/>
-              </w:rPr>
-            </w:pPr>
-            <w:r>
-              <w:rPr>
-                <w:b/>
-                <w:sz w:val="16"/>
-              </w:rPr>
-            </w:r>
-            <w:proofErr w:type="spellStart"/>
-            <w:r>
-              <w:rPr>
-                <w:b/>
-                <w:sz w:val="16"/>
-              </w:rPr>
-            </w:r>
-            <w:proofErr w:type="spellEnd"/>
-            <w:r>
-              <w:rPr>
-                <w:rFonts w:ascii="Malgun Gothic" w:hAnsi="Malgun Gothic"/>
-                <w:b w:val="0"/>
-                <w:sz w:val="18"/>
-              </w:rPr>
-            </w:r>
-          </w:p>
-          <w:p>
-            <w:pPr>
-              <w:jc w:val="center"/>
-              <w:cnfStyle w:val="000000100000" w:firstRow="0" w:lastRow="0" w:firstColumn="0" w:lastColumn="0" w:oddVBand="0" w:evenVBand="0" w:oddHBand="1" w:evenHBand="0" w:firstRowFirstColumn="0" w:firstRowLastColumn="0" w:lastRowFirstColumn="0" w:lastRowLastColumn="0"/>
-              <w:rPr>
-                <w:rFonts w:ascii="Arial Narrow" w:hAnsi="Arial Narrow" w:cs="Calibri"/>
-                <w:b/>
-                <w:sz w:val="16"/>
-              </w:rPr>
-            </w:pPr>
-            <w:r>
-              <w:rPr>
-                <w:b/>
-                <w:sz w:val="14"/>
-              </w:rPr>
-            </w:r>
-            <w:proofErr w:type="spellStart"/>
-            <w:r>
-              <w:rPr>
-                <w:b/>
-                <w:sz w:val="14"/>
-              </w:rPr>
-            </w:r>
-            <w:proofErr w:type="spellEnd"/>
-            <w:r>
-              <w:rPr>
-                <w:b/>
-                <w:sz w:val="14"/>
-              </w:rPr>
-            </w:r>
-          </w:p>
-        </w:tc>
-      </w:tr>
-      <w:tr>
-        <w:trPr>
-          <w:cnfStyle w:val="000000100000" w:firstRow="0" w:lastRow="0" w:firstColumn="0" w:lastColumn="0" w:oddVBand="0" w:evenVBand="0" w:oddHBand="1" w:evenHBand="0" w:firstRowFirstColumn="0" w:firstRowLastColumn="0" w:lastRowFirstColumn="0" w:lastRowLastColumn="0"/>
-          <w:trHeight w:hRule="exact" w:val="624"/>
-        </w:trPr>
-        <w:tc>
-          <w:tcPr>
-            <w:cnfStyle w:val="001000000000" w:firstRow="0" w:lastRow="0" w:firstColumn="1" w:lastColumn="0" w:oddVBand="0" w:evenVBand="0" w:oddHBand="0" w:evenHBand="0" w:firstRowFirstColumn="0" w:firstRowLastColumn="0" w:lastRowFirstColumn="0" w:lastRowLastColumn="0"/>
-            <w:tcW w:w="1276" w:type="dxa"/>
-            <w:tcBorders>
-              <w:top w:val="double" w:sz="4" w:space="0" w:color="auto"/>
-              <w:bottom w:val="double" w:sz="4" w:space="0" w:color="auto"/>
-            </w:tcBorders>
-            <w:vAlign w:val="center"/>
-          </w:tcPr>
-          <w:p>
-            <w:pPr>
-              <w:spacing w:after="160" w:line="259" w:lineRule="auto"/>
-              <w:jc w:val="center"/>
-              <w:rPr>
-                <w:sz w:val="16"/>
-              </w:rPr>
-            </w:pPr>
-            <w:r>
-              <w:rPr>
-                <w:caps w:val="0"/>
-                <w:sz w:val="16"/>
-              </w:rPr>
-            </w:r>
-            <w:r>
-              <w:rPr>
-                <w:rFonts w:ascii="Malgun Gothic" w:hAnsi="Malgun Gothic"/>
-                <w:b w:val="0"/>
-                <w:sz w:val="18"/>
-              </w:rPr>
-              <w:t>Tier 3</w:t>
-            </w:r>
-          </w:p>
-        </w:tc>
-        <w:tc>
-          <w:tcPr>
-            <w:tcW w:w="1134" w:type="dxa"/>
-            <w:tcBorders>
-              <w:top w:val="double" w:sz="4" w:space="0" w:color="auto"/>
-              <w:bottom w:val="double" w:sz="4" w:space="0" w:color="auto"/>
-            </w:tcBorders>
-            <w:vAlign w:val="center"/>
-          </w:tcPr>
-          <w:p>
-            <w:pPr>
-              <w:jc w:val="center"/>
-              <w:cnfStyle w:val="000000100000" w:firstRow="0" w:lastRow="0" w:firstColumn="0" w:lastColumn="0" w:oddVBand="0" w:evenVBand="0" w:oddHBand="1" w:evenHBand="0" w:firstRowFirstColumn="0" w:firstRowLastColumn="0" w:lastRowFirstColumn="0" w:lastRowLastColumn="0"/>
-              <w:rPr>
-                <w:rFonts w:ascii="Arial Narrow" w:hAnsi="Arial Narrow" w:cs="Calibri"/>
-                <w:b/>
-                <w:sz w:val="16"/>
-              </w:rPr>
-            </w:pPr>
-            <w:r>
-              <w:rPr>
-                <w:b/>
-                <w:sz w:val="16"/>
-              </w:rPr>
-            </w:r>
-            <w:r>
-              <w:rPr>
-                <w:rFonts w:ascii="Malgun Gothic" w:hAnsi="Malgun Gothic"/>
-                <w:b w:val="0"/>
-                <w:sz w:val="18"/>
-              </w:rPr>
-              <w:t>KMT2C</w:t>
-            </w:r>
-          </w:p>
-        </w:tc>
-        <w:tc>
-          <w:tcPr>
-            <w:tcW w:w="1134" w:type="dxa"/>
-            <w:tcBorders>
-              <w:top w:val="double" w:sz="4" w:space="0" w:color="auto"/>
-              <w:bottom w:val="double" w:sz="4" w:space="0" w:color="auto"/>
-            </w:tcBorders>
-            <w:vAlign w:val="center"/>
-          </w:tcPr>
-          <w:p>
-            <w:pPr>
-              <w:jc w:val="center"/>
-              <w:cnfStyle w:val="000000100000" w:firstRow="0" w:lastRow="0" w:firstColumn="0" w:lastColumn="0" w:oddVBand="0" w:evenVBand="0" w:oddHBand="1" w:evenHBand="0" w:firstRowFirstColumn="0" w:firstRowLastColumn="0" w:lastRowFirstColumn="0" w:lastRowLastColumn="0"/>
-              <w:rPr>
-                <w:b/>
-                <w:sz w:val="16"/>
-              </w:rPr>
-            </w:pPr>
-            <w:r>
-              <w:rPr>
-                <w:b/>
-                <w:sz w:val="16"/>
-              </w:rPr>
-            </w:r>
-            <w:r>
-              <w:rPr>
-                <w:rFonts w:ascii="Malgun Gothic" w:hAnsi="Malgun Gothic"/>
-                <w:b w:val="0"/>
-                <w:sz w:val="18"/>
-              </w:rPr>
-              <w:t>ENST00000262189.6</w:t>
-            </w:r>
-          </w:p>
-          <w:p>
-            <w:pPr>
-              <w:jc w:val="center"/>
-              <w:cnfStyle w:val="000000100000" w:firstRow="0" w:lastRow="0" w:firstColumn="0" w:lastColumn="0" w:oddVBand="0" w:evenVBand="0" w:oddHBand="1" w:evenHBand="0" w:firstRowFirstColumn="0" w:firstRowLastColumn="0" w:lastRowFirstColumn="0" w:lastRowLastColumn="0"/>
-              <w:rPr>
-                <w:rFonts w:ascii="Arial Narrow" w:hAnsi="Arial Narrow" w:cs="Calibri"/>
-                <w:b/>
-                <w:sz w:val="16"/>
-              </w:rPr>
-            </w:pPr>
-            <w:r>
-              <w:rPr>
-                <w:b/>
-                <w:sz w:val="16"/>
-              </w:rPr>
-            </w:r>
-          </w:p>
-        </w:tc>
-        <w:tc>
-          <w:tcPr>
-            <w:tcW w:w="1418" w:type="dxa"/>
-            <w:tcBorders>
-              <w:top w:val="double" w:sz="4" w:space="0" w:color="auto"/>
-              <w:bottom w:val="double" w:sz="4" w:space="0" w:color="auto"/>
-            </w:tcBorders>
-            <w:vAlign w:val="center"/>
-          </w:tcPr>
-          <w:p>
-            <w:pPr>
-              <w:jc w:val="center"/>
-              <w:cnfStyle w:val="000000100000" w:firstRow="0" w:lastRow="0" w:firstColumn="0" w:lastColumn="0" w:oddVBand="0" w:evenVBand="0" w:oddHBand="1" w:evenHBand="0" w:firstRowFirstColumn="0" w:firstRowLastColumn="0" w:lastRowFirstColumn="0" w:lastRowLastColumn="0"/>
-              <w:rPr>
-                <w:rFonts w:ascii="Arial Narrow" w:hAnsi="Arial Narrow" w:cs="Calibri"/>
-                <w:b/>
-                <w:sz w:val="16"/>
-              </w:rPr>
-            </w:pPr>
-            <w:r>
-              <w:rPr>
-                <w:b/>
-                <w:sz w:val="16"/>
-              </w:rPr>
-            </w:r>
-            <w:r>
-              <w:rPr>
-                <w:rFonts w:ascii="Malgun Gothic" w:hAnsi="Malgun Gothic"/>
-                <w:b w:val="0"/>
-                <w:sz w:val="18"/>
-              </w:rPr>
-              <w:t>ENSP00000262189.6</w:t>
-            </w:r>
-          </w:p>
-        </w:tc>
-        <w:tc>
-          <w:tcPr>
-            <w:tcW w:w="1275" w:type="dxa"/>
-            <w:tcBorders>
-              <w:top w:val="double" w:sz="4" w:space="0" w:color="auto"/>
-              <w:bottom w:val="double" w:sz="4" w:space="0" w:color="auto"/>
-            </w:tcBorders>
-            <w:vAlign w:val="center"/>
-          </w:tcPr>
-          <w:p>
-            <w:pPr>
-              <w:spacing w:after="160" w:line="259" w:lineRule="auto"/>
-              <w:jc w:val="center"/>
-              <w:cnfStyle w:val="000000100000" w:firstRow="0" w:lastRow="0" w:firstColumn="0" w:lastColumn="0" w:oddVBand="0" w:evenVBand="0" w:oddHBand="1" w:evenHBand="0" w:firstRowFirstColumn="0" w:firstRowLastColumn="0" w:lastRowFirstColumn="0" w:lastRowLastColumn="0"/>
-              <w:rPr>
-                <w:b/>
-                <w:sz w:val="16"/>
-              </w:rPr>
-            </w:pPr>
-            <w:r>
-              <w:rPr>
-                <w:b/>
-                <w:sz w:val="16"/>
-              </w:rPr>
-            </w:r>
-            <w:r>
-              <w:rPr>
-                <w:rFonts w:ascii="Malgun Gothic" w:hAnsi="Malgun Gothic"/>
-                <w:b w:val="0"/>
-                <w:sz w:val="18"/>
-              </w:rPr>
-              <w:t>c.2263C&gt;T</w:t>
-            </w:r>
-          </w:p>
-        </w:tc>
-        <w:tc>
-          <w:tcPr>
-            <w:tcW w:w="1276" w:type="dxa"/>
-            <w:tcBorders>
-              <w:top w:val="double" w:sz="4" w:space="0" w:color="auto"/>
-              <w:bottom w:val="double" w:sz="4" w:space="0" w:color="auto"/>
-            </w:tcBorders>
-            <w:vAlign w:val="center"/>
-          </w:tcPr>
-          <w:p>
-            <w:pPr>
-              <w:jc w:val="center"/>
-              <w:cnfStyle w:val="000000100000" w:firstRow="0" w:lastRow="0" w:firstColumn="0" w:lastColumn="0" w:oddVBand="0" w:evenVBand="0" w:oddHBand="1" w:evenHBand="0" w:firstRowFirstColumn="0" w:firstRowLastColumn="0" w:lastRowFirstColumn="0" w:lastRowLastColumn="0"/>
-              <w:rPr>
-                <w:rFonts w:ascii="Arial Narrow" w:hAnsi="Arial Narrow" w:cs="Calibri"/>
-                <w:b/>
-                <w:sz w:val="16"/>
-              </w:rPr>
-            </w:pPr>
-            <w:r>
-              <w:rPr>
-                <w:b/>
-                <w:sz w:val="16"/>
-              </w:rPr>
-            </w:r>
-            <w:r>
-              <w:rPr>
-                <w:rFonts w:ascii="Malgun Gothic" w:hAnsi="Malgun Gothic"/>
-                <w:b w:val="0"/>
-                <w:sz w:val="18"/>
-              </w:rPr>
-              <w:t>p.Gln755Ter</w:t>
-            </w:r>
-          </w:p>
-        </w:tc>
-        <w:tc>
-          <w:tcPr>
-            <w:tcW w:w="709" w:type="dxa"/>
-            <w:tcBorders>
-              <w:top w:val="double" w:sz="4" w:space="0" w:color="auto"/>
-              <w:bottom w:val="double" w:sz="4" w:space="0" w:color="auto"/>
-            </w:tcBorders>
-            <w:vAlign w:val="center"/>
-          </w:tcPr>
-          <w:p>
-            <w:pPr>
-              <w:jc w:val="center"/>
-              <w:cnfStyle w:val="000000100000" w:firstRow="0" w:lastRow="0" w:firstColumn="0" w:lastColumn="0" w:oddVBand="0" w:evenVBand="0" w:oddHBand="1" w:evenHBand="0" w:firstRowFirstColumn="0" w:firstRowLastColumn="0" w:lastRowFirstColumn="0" w:lastRowLastColumn="0"/>
-              <w:rPr>
-                <w:rFonts w:ascii="Arial Narrow" w:hAnsi="Arial Narrow" w:cs="Calibri"/>
-                <w:b/>
-                <w:sz w:val="16"/>
-              </w:rPr>
-            </w:pPr>
-            <w:r>
-              <w:rPr>
-                <w:b/>
-                <w:sz w:val="16"/>
-              </w:rPr>
-            </w:r>
-            <w:r>
-              <w:rPr>
-                <w:rFonts w:ascii="Malgun Gothic" w:hAnsi="Malgun Gothic"/>
-                <w:b w:val="0"/>
-                <w:sz w:val="18"/>
-              </w:rPr>
               <w:t>2.83%</w:t>
-            </w:r>
-          </w:p>
-        </w:tc>
-        <w:tc>
-          <w:tcPr>
-            <w:tcW w:w="2214" w:type="dxa"/>
-            <w:tcBorders>
-              <w:top w:val="double" w:sz="4" w:space="0" w:color="auto"/>
-              <w:bottom w:val="double" w:sz="4" w:space="0" w:color="auto"/>
-            </w:tcBorders>
-            <w:vAlign w:val="center"/>
-          </w:tcPr>
-          <w:p>
-            <w:pPr>
-              <w:jc w:val="center"/>
-              <w:cnfStyle w:val="000000100000" w:firstRow="0" w:lastRow="0" w:firstColumn="0" w:lastColumn="0" w:oddVBand="0" w:evenVBand="0" w:oddHBand="1" w:evenHBand="0" w:firstRowFirstColumn="0" w:firstRowLastColumn="0" w:lastRowFirstColumn="0" w:lastRowLastColumn="0"/>
-              <w:rPr>
-                <w:b/>
-                <w:sz w:val="16"/>
-              </w:rPr>
-            </w:pPr>
-            <w:r>
-              <w:rPr>
-                <w:b/>
-                <w:sz w:val="16"/>
-              </w:rPr>
-            </w:r>
-            <w:proofErr w:type="spellStart"/>
-            <w:r>
-              <w:rPr>
-                <w:b/>
-                <w:sz w:val="16"/>
-              </w:rPr>
-            </w:r>
-            <w:proofErr w:type="spellEnd"/>
-            <w:r>
-              <w:rPr>
-                <w:rFonts w:ascii="Malgun Gothic" w:hAnsi="Malgun Gothic"/>
-                <w:b w:val="0"/>
-                <w:sz w:val="18"/>
-              </w:rPr>
-            </w:r>
-          </w:p>
-          <w:p>
-            <w:pPr>
-              <w:jc w:val="center"/>
-              <w:cnfStyle w:val="000000100000" w:firstRow="0" w:lastRow="0" w:firstColumn="0" w:lastColumn="0" w:oddVBand="0" w:evenVBand="0" w:oddHBand="1" w:evenHBand="0" w:firstRowFirstColumn="0" w:firstRowLastColumn="0" w:lastRowFirstColumn="0" w:lastRowLastColumn="0"/>
-              <w:rPr>
-                <w:rFonts w:ascii="Arial Narrow" w:hAnsi="Arial Narrow" w:cs="Calibri"/>
-                <w:b/>
-                <w:sz w:val="16"/>
-              </w:rPr>
-            </w:pPr>
-            <w:r>
-              <w:rPr>
-                <w:b/>
-                <w:sz w:val="14"/>
-              </w:rPr>
-            </w:r>
-            <w:proofErr w:type="spellStart"/>
-            <w:r>
-              <w:rPr>
-                <w:b/>
-                <w:sz w:val="14"/>
-              </w:rPr>
-            </w:r>
-            <w:proofErr w:type="spellEnd"/>
-            <w:r>
-              <w:rPr>
-                <w:b/>
-                <w:sz w:val="14"/>
-              </w:rPr>
-            </w:r>
-          </w:p>
-        </w:tc>
-      </w:tr>
-      <w:tr>
-        <w:trPr>
-          <w:cnfStyle w:val="000000100000" w:firstRow="0" w:lastRow="0" w:firstColumn="0" w:lastColumn="0" w:oddVBand="0" w:evenVBand="0" w:oddHBand="1" w:evenHBand="0" w:firstRowFirstColumn="0" w:firstRowLastColumn="0" w:lastRowFirstColumn="0" w:lastRowLastColumn="0"/>
-          <w:trHeight w:hRule="exact" w:val="624"/>
-        </w:trPr>
-        <w:tc>
-          <w:tcPr>
-            <w:cnfStyle w:val="001000000000" w:firstRow="0" w:lastRow="0" w:firstColumn="1" w:lastColumn="0" w:oddVBand="0" w:evenVBand="0" w:oddHBand="0" w:evenHBand="0" w:firstRowFirstColumn="0" w:firstRowLastColumn="0" w:lastRowFirstColumn="0" w:lastRowLastColumn="0"/>
-            <w:tcW w:w="1276" w:type="dxa"/>
-            <w:tcBorders>
-              <w:top w:val="double" w:sz="4" w:space="0" w:color="auto"/>
-              <w:bottom w:val="double" w:sz="4" w:space="0" w:color="auto"/>
-            </w:tcBorders>
-            <w:vAlign w:val="center"/>
-          </w:tcPr>
-          <w:p>
-            <w:pPr>
-              <w:spacing w:after="160" w:line="259" w:lineRule="auto"/>
-              <w:jc w:val="center"/>
-              <w:rPr>
-                <w:sz w:val="16"/>
-              </w:rPr>
-            </w:pPr>
-            <w:r>
-              <w:rPr>
-                <w:caps w:val="0"/>
-                <w:sz w:val="16"/>
-              </w:rPr>
-            </w:r>
-            <w:r>
-              <w:rPr>
-                <w:rFonts w:ascii="Malgun Gothic" w:hAnsi="Malgun Gothic"/>
-                <w:b w:val="0"/>
-                <w:sz w:val="18"/>
-              </w:rPr>
-              <w:t>Tier 3</w:t>
-            </w:r>
-          </w:p>
-        </w:tc>
-        <w:tc>
-          <w:tcPr>
-            <w:tcW w:w="1134" w:type="dxa"/>
-            <w:tcBorders>
-              <w:top w:val="double" w:sz="4" w:space="0" w:color="auto"/>
-              <w:bottom w:val="double" w:sz="4" w:space="0" w:color="auto"/>
-            </w:tcBorders>
-            <w:vAlign w:val="center"/>
-          </w:tcPr>
-          <w:p>
-            <w:pPr>
-              <w:jc w:val="center"/>
-              <w:cnfStyle w:val="000000100000" w:firstRow="0" w:lastRow="0" w:firstColumn="0" w:lastColumn="0" w:oddVBand="0" w:evenVBand="0" w:oddHBand="1" w:evenHBand="0" w:firstRowFirstColumn="0" w:firstRowLastColumn="0" w:lastRowFirstColumn="0" w:lastRowLastColumn="0"/>
-              <w:rPr>
-                <w:rFonts w:ascii="Arial Narrow" w:hAnsi="Arial Narrow" w:cs="Calibri"/>
-                <w:b/>
-                <w:sz w:val="16"/>
-              </w:rPr>
-            </w:pPr>
-            <w:r>
-              <w:rPr>
-                <w:b/>
-                <w:sz w:val="16"/>
-              </w:rPr>
-            </w:r>
-            <w:r>
-              <w:rPr>
-                <w:rFonts w:ascii="Malgun Gothic" w:hAnsi="Malgun Gothic"/>
-                <w:b w:val="0"/>
-                <w:sz w:val="18"/>
-              </w:rPr>
-              <w:t>WHSC1</w:t>
-            </w:r>
-          </w:p>
-        </w:tc>
-        <w:tc>
-          <w:tcPr>
-            <w:tcW w:w="1134" w:type="dxa"/>
-            <w:tcBorders>
-              <w:top w:val="double" w:sz="4" w:space="0" w:color="auto"/>
-              <w:bottom w:val="double" w:sz="4" w:space="0" w:color="auto"/>
-            </w:tcBorders>
-            <w:vAlign w:val="center"/>
-          </w:tcPr>
-          <w:p>
-            <w:pPr>
-              <w:jc w:val="center"/>
-              <w:cnfStyle w:val="000000100000" w:firstRow="0" w:lastRow="0" w:firstColumn="0" w:lastColumn="0" w:oddVBand="0" w:evenVBand="0" w:oddHBand="1" w:evenHBand="0" w:firstRowFirstColumn="0" w:firstRowLastColumn="0" w:lastRowFirstColumn="0" w:lastRowLastColumn="0"/>
-              <w:rPr>
-                <w:b/>
-                <w:sz w:val="16"/>
-              </w:rPr>
-            </w:pPr>
-            <w:r>
-              <w:rPr>
-                <w:b/>
-                <w:sz w:val="16"/>
-              </w:rPr>
-            </w:r>
-            <w:r>
-              <w:rPr>
-                <w:rFonts w:ascii="Malgun Gothic" w:hAnsi="Malgun Gothic"/>
-                <w:b w:val="0"/>
-                <w:sz w:val="18"/>
-              </w:rPr>
-              <w:t>ENST00000382895.3</w:t>
-            </w:r>
-          </w:p>
-          <w:p>
-            <w:pPr>
-              <w:jc w:val="center"/>
-              <w:cnfStyle w:val="000000100000" w:firstRow="0" w:lastRow="0" w:firstColumn="0" w:lastColumn="0" w:oddVBand="0" w:evenVBand="0" w:oddHBand="1" w:evenHBand="0" w:firstRowFirstColumn="0" w:firstRowLastColumn="0" w:lastRowFirstColumn="0" w:lastRowLastColumn="0"/>
-              <w:rPr>
-                <w:rFonts w:ascii="Arial Narrow" w:hAnsi="Arial Narrow" w:cs="Calibri"/>
-                <w:b/>
-                <w:sz w:val="16"/>
-              </w:rPr>
-            </w:pPr>
-            <w:r>
-              <w:rPr>
-                <w:b/>
-                <w:sz w:val="16"/>
-              </w:rPr>
-            </w:r>
-          </w:p>
-        </w:tc>
-        <w:tc>
-          <w:tcPr>
-            <w:tcW w:w="1418" w:type="dxa"/>
-            <w:tcBorders>
-              <w:top w:val="double" w:sz="4" w:space="0" w:color="auto"/>
-              <w:bottom w:val="double" w:sz="4" w:space="0" w:color="auto"/>
-            </w:tcBorders>
-            <w:vAlign w:val="center"/>
-          </w:tcPr>
-          <w:p>
-            <w:pPr>
-              <w:jc w:val="center"/>
-              <w:cnfStyle w:val="000000100000" w:firstRow="0" w:lastRow="0" w:firstColumn="0" w:lastColumn="0" w:oddVBand="0" w:evenVBand="0" w:oddHBand="1" w:evenHBand="0" w:firstRowFirstColumn="0" w:firstRowLastColumn="0" w:lastRowFirstColumn="0" w:lastRowLastColumn="0"/>
-              <w:rPr>
-                <w:rFonts w:ascii="Arial Narrow" w:hAnsi="Arial Narrow" w:cs="Calibri"/>
-                <w:b/>
-                <w:sz w:val="16"/>
-              </w:rPr>
-            </w:pPr>
-            <w:r>
-              <w:rPr>
-                <w:b/>
-                <w:sz w:val="16"/>
-              </w:rPr>
-            </w:r>
-            <w:r>
-              <w:rPr>
-                <w:rFonts w:ascii="Malgun Gothic" w:hAnsi="Malgun Gothic"/>
-                <w:b w:val="0"/>
-                <w:sz w:val="18"/>
-              </w:rPr>
-            </w:r>
-          </w:p>
-        </w:tc>
-        <w:tc>
-          <w:tcPr>
-            <w:tcW w:w="1275" w:type="dxa"/>
-            <w:tcBorders>
-              <w:top w:val="double" w:sz="4" w:space="0" w:color="auto"/>
-              <w:bottom w:val="double" w:sz="4" w:space="0" w:color="auto"/>
-            </w:tcBorders>
-            <w:vAlign w:val="center"/>
-          </w:tcPr>
-          <w:p>
-            <w:pPr>
-              <w:spacing w:after="160" w:line="259" w:lineRule="auto"/>
-              <w:jc w:val="center"/>
-              <w:cnfStyle w:val="000000100000" w:firstRow="0" w:lastRow="0" w:firstColumn="0" w:lastColumn="0" w:oddVBand="0" w:evenVBand="0" w:oddHBand="1" w:evenHBand="0" w:firstRowFirstColumn="0" w:firstRowLastColumn="0" w:lastRowFirstColumn="0" w:lastRowLastColumn="0"/>
-              <w:rPr>
-                <w:b/>
-                <w:sz w:val="16"/>
-              </w:rPr>
-            </w:pPr>
-            <w:r>
-              <w:rPr>
-                <w:b/>
-                <w:sz w:val="16"/>
-              </w:rPr>
-            </w:r>
-            <w:r>
-              <w:rPr>
-                <w:rFonts w:ascii="Malgun Gothic" w:hAnsi="Malgun Gothic"/>
-                <w:b w:val="0"/>
-                <w:sz w:val="18"/>
-              </w:rPr>
-              <w:t>c.928-6dup</w:t>
-            </w:r>
-          </w:p>
-        </w:tc>
-        <w:tc>
-          <w:tcPr>
-            <w:tcW w:w="1276" w:type="dxa"/>
-            <w:tcBorders>
-              <w:top w:val="double" w:sz="4" w:space="0" w:color="auto"/>
-              <w:bottom w:val="double" w:sz="4" w:space="0" w:color="auto"/>
-            </w:tcBorders>
-            <w:vAlign w:val="center"/>
-          </w:tcPr>
-          <w:p>
-            <w:pPr>
-              <w:jc w:val="center"/>
-              <w:cnfStyle w:val="000000100000" w:firstRow="0" w:lastRow="0" w:firstColumn="0" w:lastColumn="0" w:oddVBand="0" w:evenVBand="0" w:oddHBand="1" w:evenHBand="0" w:firstRowFirstColumn="0" w:firstRowLastColumn="0" w:lastRowFirstColumn="0" w:lastRowLastColumn="0"/>
-              <w:rPr>
-                <w:rFonts w:ascii="Arial Narrow" w:hAnsi="Arial Narrow" w:cs="Calibri"/>
-                <w:b/>
-                <w:sz w:val="16"/>
-              </w:rPr>
-            </w:pPr>
-            <w:r>
-              <w:rPr>
-                <w:b/>
-                <w:sz w:val="16"/>
-              </w:rPr>
-            </w:r>
-            <w:r>
-              <w:rPr>
-                <w:rFonts w:ascii="Malgun Gothic" w:hAnsi="Malgun Gothic"/>
-                <w:b w:val="0"/>
-                <w:sz w:val="18"/>
-              </w:rPr>
-            </w:r>
-          </w:p>
-        </w:tc>
-        <w:tc>
-          <w:tcPr>
-            <w:tcW w:w="709" w:type="dxa"/>
-            <w:tcBorders>
-              <w:top w:val="double" w:sz="4" w:space="0" w:color="auto"/>
-              <w:bottom w:val="double" w:sz="4" w:space="0" w:color="auto"/>
-            </w:tcBorders>
-            <w:vAlign w:val="center"/>
-          </w:tcPr>
-          <w:p>
-            <w:pPr>
-              <w:jc w:val="center"/>
-              <w:cnfStyle w:val="000000100000" w:firstRow="0" w:lastRow="0" w:firstColumn="0" w:lastColumn="0" w:oddVBand="0" w:evenVBand="0" w:oddHBand="1" w:evenHBand="0" w:firstRowFirstColumn="0" w:firstRowLastColumn="0" w:lastRowFirstColumn="0" w:lastRowLastColumn="0"/>
-              <w:rPr>
-                <w:rFonts w:ascii="Arial Narrow" w:hAnsi="Arial Narrow" w:cs="Calibri"/>
-                <w:b/>
-                <w:sz w:val="16"/>
-              </w:rPr>
-            </w:pPr>
-            <w:r>
-              <w:rPr>
-                <w:b/>
-                <w:sz w:val="16"/>
-              </w:rPr>
-            </w:r>
-            <w:r>
-              <w:rPr>
-                <w:rFonts w:ascii="Malgun Gothic" w:hAnsi="Malgun Gothic"/>
-                <w:b w:val="0"/>
-                <w:sz w:val="18"/>
-              </w:rPr>
-              <w:t>1.88%</w:t>
             </w:r>
           </w:p>
         </w:tc>

</xml_diff>